<commit_message>
Keep a bound value from opening a block construct in a markdown template
A value starting with four spaces or a tab became an indented code block,
and a value reading [TOC] (or [SECTION] beside a template attribute) became
a table of contents or section break. No backslash reaches either, so the
encoder writes a value's leading space, tab or opening bracket as a
character reference, and the renderer now writes references out as text
instead of dropping them.
</commit_message>
<xml_diff>
--- a/src/Parchment.Tests/NaughtyStringsTests.Markdown.verified.docx
+++ b/src/Parchment.Tests/NaughtyStringsTests.Markdown.verified.docx
@@ -5875,6 +5875,19 @@
       </w:pPr>
       <w:r>
         <w:t xml:space="preserve">'; EXEC sp_MSForEachTable 'DROP TABLE ?'; --</w:t>
+      </w:r>
+    </w:p>
+    <w:p>
+      <w:pPr>
+        <w:pStyle w:val="ListParagraph"/>
+        <w:numPr>
+          <w:ilvl w:val="0"/>
+          <w:numId w:val="1"/>
+        </w:numPr>
+        <w:contextualSpacing/>
+      </w:pPr>
+      <w:r>
+        <w:t xml:space="preserve"> </w:t>
       </w:r>
     </w:p>
     <w:p>

</xml_diff>